<commit_message>
docs: add project README and update RAG progress report
</commit_message>
<xml_diff>
--- a/CS6493 RAG Progress Report final.docx
+++ b/CS6493 RAG Progress Report final.docx
@@ -79,7 +79,29 @@
           <w:sz w:val="20"/>
           <w:szCs w:val="20"/>
         </w:rPr>
-        <w:t>[Group Name: RAGdoll]</w:t>
+        <w:t>[Group Name:</w:t>
+      </w:r>
+      <w:r>
+        <w:rPr>
+          <w:rFonts w:asciiTheme="minorEastAsia" w:hAnsiTheme="minorEastAsia" w:hint="eastAsia"/>
+          <w:b/>
+          <w:bCs/>
+          <w:color w:val="595959"/>
+          <w:sz w:val="20"/>
+          <w:szCs w:val="20"/>
+        </w:rPr>
+        <w:t>xxx</w:t>
+      </w:r>
+      <w:r>
+        <w:rPr>
+          <w:rFonts w:eastAsia="Arial"/>
+          <w:b/>
+          <w:bCs/>
+          <w:color w:val="595959"/>
+          <w:sz w:val="20"/>
+          <w:szCs w:val="20"/>
+        </w:rPr>
+        <w:t>]</w:t>
       </w:r>
     </w:p>
     <w:p>
@@ -102,15 +124,37 @@
           <w:sz w:val="18"/>
           <w:szCs w:val="18"/>
         </w:rPr>
-        <w:t>[Group Member Names:Huibo LI, Lingke MENG, shibo WANG, Xinrui SHAN, Yue ZHANG]</w:t>
-      </w:r>
-      <w:r>
-        <w:rPr>
-          <w:rFonts w:eastAsia="Arial"/>
+        <w:t>[</w:t>
+      </w:r>
+      <w:r>
+        <w:rPr>
+          <w:rFonts w:eastAsia="Arial"/>
+          <w:b/>
+          <w:bCs/>
           <w:color w:val="595959"/>
           <w:sz w:val="18"/>
           <w:szCs w:val="18"/>
         </w:rPr>
+        <w:t>Anonymous Author(s)</w:t>
+      </w:r>
+      <w:r>
+        <w:rPr>
+          <w:rFonts w:eastAsia="Arial"/>
+          <w:b/>
+          <w:bCs/>
+          <w:color w:val="595959"/>
+          <w:sz w:val="18"/>
+          <w:szCs w:val="18"/>
+        </w:rPr>
+        <w:t>]</w:t>
+      </w:r>
+      <w:r>
+        <w:rPr>
+          <w:rFonts w:eastAsia="Arial"/>
+          <w:color w:val="595959"/>
+          <w:sz w:val="18"/>
+          <w:szCs w:val="18"/>
+        </w:rPr>
         <w:t xml:space="preserve"> </w:t>
       </w:r>
       <w:r>
@@ -121,46 +165,6 @@
           <w:szCs w:val="20"/>
         </w:rPr>
         <w:t xml:space="preserve"> </w:t>
-      </w:r>
-    </w:p>
-    <w:p>
-      <w:pPr>
-        <w:spacing w:after="40"/>
-        <w:jc w:val="center"/>
-      </w:pPr>
-      <w:r>
-        <w:rPr>
-          <w:rFonts w:eastAsia="Arial"/>
-          <w:b/>
-          <w:bCs/>
-          <w:color w:val="595959"/>
-          <w:sz w:val="20"/>
-          <w:szCs w:val="20"/>
-        </w:rPr>
-        <w:t xml:space="preserve">[Student </w:t>
-      </w:r>
-      <w:r>
-        <w:rPr>
-          <w:rFonts w:eastAsia="Arial" w:hint="eastAsia"/>
-          <w:b/>
-          <w:bCs/>
-          <w:color w:val="595959"/>
-          <w:sz w:val="20"/>
-          <w:szCs w:val="20"/>
-          <w:lang w:eastAsia="zh-Hans"/>
-        </w:rPr>
-        <w:t>E</w:t>
-      </w:r>
-      <w:r>
-        <w:rPr>
-          <w:rFonts w:eastAsia="Arial"/>
-          <w:b/>
-          <w:bCs/>
-          <w:color w:val="595959"/>
-          <w:sz w:val="20"/>
-          <w:szCs w:val="20"/>
-        </w:rPr>
-        <w:t>IDs: huiboli2, lkmeng4, shibowang3, xinruis2, yzhang8384]</w:t>
       </w:r>
     </w:p>
     <w:p>
@@ -3521,7 +3525,6 @@
   <w:style w:type="character" w:default="1" w:styleId="a0">
     <w:name w:val="Default Paragraph Font"/>
     <w:uiPriority w:val="1"/>
-    <w:semiHidden/>
     <w:unhideWhenUsed/>
   </w:style>
   <w:style w:type="table" w:default="1" w:styleId="a1">

</xml_diff>